<commit_message>
Add grouped collection IDs for aid-onset target of 60
</commit_message>
<xml_diff>
--- a/analysis_outputs/participant_exclusion_summary_20261021/aid_onset_reviewed_exclusions.docx
+++ b/analysis_outputs/participant_exclusion_summary_20261021/aid_onset_reviewed_exclusions.docx
@@ -565,6 +565,49 @@
         <w:pStyle w:val="Heading2"/>
       </w:pPr>
       <w:r>
+        <w:t>Remaining participant IDs to collect</w:t>
+      </w:r>
+    </w:p>
+    <w:p>
+      <w:r>
+        <w:rPr>
+          <w:b/>
+        </w:rPr>
+        <w:t xml:space="preserve">Re-collect: </w:t>
+      </w:r>
+      <w:r>
+        <w:t>010, 013, 020, 022, 027 (5 participants, if the candidate exclusions are confirmed).</w:t>
+      </w:r>
+    </w:p>
+    <w:p>
+      <w:r>
+        <w:rPr>
+          <w:b/>
+        </w:rPr>
+        <w:t xml:space="preserve">New participants: </w:t>
+      </w:r>
+      <w:r>
+        <w:t>None. All IDs 001-060 have been collected.</w:t>
+      </w:r>
+    </w:p>
+    <w:p>
+      <w:r>
+        <w:t>Total remaining: 5 re-collections if all five candidates are excluded and replaced, to retain the target of 60 participants. The five candidates remain included in the current analysis. Participant 059 already has a retained replacement and does not need re-collection.</w:t>
+      </w:r>
+    </w:p>
+    <w:p>
+      <w:pPr>
+        <w:pStyle w:val="SourceNote"/>
+      </w:pPr>
+      <w:r>
+        <w:t>Collection status checked against data/collation_manifest.csv on 21 October 2026. Target: 60 retained participants.</w:t>
+      </w:r>
+    </w:p>
+    <w:p>
+      <w:pPr>
+        <w:pStyle w:val="Heading2"/>
+      </w:pPr>
+      <w:r>
         <w:t>Review criteria</w:t>
       </w:r>
     </w:p>

</xml_diff>